<commit_message>
Link publish date and holiday/period cells to source URLs
</commit_message>
<xml_diff>
--- a/feedback/Datavoy review feedback.docx
+++ b/feedback/Datavoy review feedback.docx
@@ -106,306 +106,330 @@
           <w:rFonts w:hint="eastAsia"/>
           <w:lang w:val="en-US" w:eastAsia="zh-CN"/>
         </w:rPr>
-        <w:t>tavoy没有一个好看的icon，比如首页左上角，就是个点点，可以帮我设计一个吗？</w:t>
-      </w:r>
+        <w:t>tavoy没有一个好看的icon，比如首页左上角，就是个点点，可以帮我设计一个吗？比较贴合我们网站的内容就可以，然后打开网站的时候，那个标签页也会对应展示</w:t>
+      </w:r>
+    </w:p>
+    <w:p>
+      <w:pPr>
+        <w:numPr>
+          <w:numId w:val="0"/>
+        </w:numPr>
+        <w:rPr>
+          <w:rFonts w:hint="eastAsia"/>
+          <w:lang w:val="en-US" w:eastAsia="zh-CN"/>
+        </w:rPr>
+      </w:pPr>
+    </w:p>
+    <w:p>
+      <w:pPr>
+        <w:numPr>
+          <w:ilvl w:val="0"/>
+          <w:numId w:val="2"/>
+        </w:numPr>
+        <w:ind w:left="0" w:leftChars="0" w:firstLine="0" w:firstLineChars="0"/>
+        <w:rPr>
+          <w:rFonts w:hint="default"/>
+          <w:lang w:val="en-US" w:eastAsia="zh-CN"/>
+        </w:rPr>
+      </w:pPr>
+      <w:r>
+        <w:rPr>
+          <w:rFonts w:hint="eastAsia"/>
+          <w:lang w:val="en-US" w:eastAsia="zh-CN"/>
+        </w:rPr>
+        <w:t>现在主页那个小飞机和太阳的位置有一些奇怪，飞机最好从右往左飞，现在是从下网上飞，其实icon的设计可以参考这个？icon可以跟飞机，数据等相关</w:t>
+      </w:r>
+    </w:p>
+    <w:p>
+      <w:pPr>
+        <w:numPr>
+          <w:numId w:val="0"/>
+        </w:numPr>
+        <w:rPr>
+          <w:rFonts w:hint="eastAsia"/>
+          <w:lang w:val="en-US" w:eastAsia="zh-CN"/>
+        </w:rPr>
+      </w:pPr>
+    </w:p>
+    <w:p>
+      <w:pPr>
+        <w:numPr>
+          <w:ilvl w:val="0"/>
+          <w:numId w:val="2"/>
+        </w:numPr>
+        <w:ind w:left="0" w:leftChars="0" w:firstLine="0" w:firstLineChars="0"/>
+        <w:rPr>
+          <w:rFonts w:hint="default"/>
+          <w:lang w:val="en-US" w:eastAsia="zh-CN"/>
+        </w:rPr>
+      </w:pPr>
+      <w:r>
+        <w:rPr>
+          <w:rFonts w:hint="eastAsia"/>
+          <w:lang w:val="en-US" w:eastAsia="zh-CN"/>
+        </w:rPr>
+        <w:t>数据更新状态，现在没说什么更新到什么时候，应该是文旅部更新到xxx这样</w:t>
+      </w:r>
+    </w:p>
+    <w:p>
+      <w:pPr>
+        <w:numPr>
+          <w:numId w:val="0"/>
+        </w:numPr>
+        <w:rPr>
+          <w:rFonts w:hint="eastAsia"/>
+          <w:lang w:val="en-US" w:eastAsia="zh-CN"/>
+        </w:rPr>
+      </w:pPr>
+    </w:p>
+    <w:p>
+      <w:pPr>
+        <w:numPr>
+          <w:ilvl w:val="0"/>
+          <w:numId w:val="2"/>
+        </w:numPr>
+        <w:ind w:left="0" w:leftChars="0" w:firstLine="0" w:firstLineChars="0"/>
+        <w:rPr>
+          <w:rFonts w:hint="default"/>
+          <w:lang w:val="en-US" w:eastAsia="zh-CN"/>
+        </w:rPr>
+      </w:pPr>
+      <w:r>
+        <w:rPr>
+          <w:rFonts w:hint="eastAsia"/>
+          <w:lang w:val="en-US" w:eastAsia="zh-CN"/>
+        </w:rPr>
+        <w:t>“留一下基本信息，方便我们未来做更精准的行业数据推送。“  我不喜欢”留一下基本信息“这个表述，比如可以说欢迎留下基本信息这种</w:t>
+      </w:r>
+    </w:p>
+    <w:p>
+      <w:pPr>
+        <w:numPr>
+          <w:numId w:val="0"/>
+        </w:numPr>
+        <w:rPr>
+          <w:rFonts w:hint="eastAsia"/>
+          <w:lang w:val="en-US" w:eastAsia="zh-CN"/>
+        </w:rPr>
+      </w:pPr>
+    </w:p>
+    <w:p>
+      <w:pPr>
+        <w:numPr>
+          <w:ilvl w:val="0"/>
+          <w:numId w:val="2"/>
+        </w:numPr>
+        <w:ind w:left="0" w:leftChars="0" w:firstLine="0" w:firstLineChars="0"/>
+        <w:rPr>
+          <w:rFonts w:hint="default"/>
+          <w:lang w:val="en-US" w:eastAsia="zh-CN"/>
+        </w:rPr>
+      </w:pPr>
+      <w:r>
+        <w:rPr>
+          <w:rFonts w:hint="eastAsia"/>
+          <w:lang w:val="en-US" w:eastAsia="zh-CN"/>
+        </w:rPr>
+        <w:t>支持我们是buy us a coffee还是buy me a coffee？是不是统一说我们比较好？“支持我们继续更新？” 我把赞赏码也换一下？</w:t>
+      </w:r>
+    </w:p>
+    <w:p>
+      <w:pPr>
+        <w:numPr>
+          <w:numId w:val="0"/>
+        </w:numPr>
+        <w:rPr>
+          <w:rFonts w:hint="eastAsia"/>
+          <w:lang w:val="en-US" w:eastAsia="zh-CN"/>
+        </w:rPr>
+      </w:pPr>
+    </w:p>
+    <w:p>
+      <w:pPr>
+        <w:numPr>
+          <w:ilvl w:val="0"/>
+          <w:numId w:val="2"/>
+        </w:numPr>
+        <w:ind w:left="0" w:leftChars="0" w:firstLine="0" w:firstLineChars="0"/>
+        <w:rPr>
+          <w:rFonts w:hint="default"/>
+          <w:lang w:val="en-US" w:eastAsia="zh-CN"/>
+        </w:rPr>
+      </w:pPr>
+      <w:r>
+        <w:rPr>
+          <w:rFonts w:hint="eastAsia"/>
+          <w:lang w:val="en-US" w:eastAsia="zh-CN"/>
+        </w:rPr>
+        <w:t>联系我们的数据存在哪里？我可以在哪里统一查找？如果我想快速做一个管理员页面，看都谁注册了，都谁留言了，就在这个网站上，麻烦嘛？</w:t>
+      </w:r>
+    </w:p>
+    <w:p>
+      <w:pPr>
+        <w:numPr>
+          <w:numId w:val="0"/>
+        </w:numPr>
+        <w:rPr>
+          <w:rFonts w:hint="eastAsia"/>
+          <w:lang w:val="en-US" w:eastAsia="zh-CN"/>
+        </w:rPr>
+      </w:pPr>
+    </w:p>
+    <w:p>
+      <w:pPr>
+        <w:numPr>
+          <w:numId w:val="0"/>
+        </w:numPr>
+        <w:rPr>
+          <w:rFonts w:hint="eastAsia"/>
+          <w:lang w:val="en-US" w:eastAsia="zh-CN"/>
+        </w:rPr>
+      </w:pPr>
+    </w:p>
+    <w:p>
+      <w:pPr>
+        <w:numPr>
+          <w:ilvl w:val="0"/>
+          <w:numId w:val="3"/>
+        </w:numPr>
+        <w:ind w:left="420" w:leftChars="0" w:hanging="420" w:firstLineChars="0"/>
+        <w:rPr>
+          <w:rFonts w:hint="default"/>
+          <w:lang w:val="en-US" w:eastAsia="zh-CN"/>
+        </w:rPr>
+      </w:pPr>
+      <w:r>
+        <w:rPr>
+          <w:rFonts w:hint="eastAsia"/>
+          <w:lang w:val="en-US" w:eastAsia="zh-CN"/>
+        </w:rPr>
+        <w:t>各数据页反馈</w:t>
+      </w:r>
+    </w:p>
+    <w:p>
+      <w:pPr>
+        <w:numPr>
+          <w:numId w:val="0"/>
+        </w:numPr>
+        <w:rPr>
+          <w:rFonts w:hint="eastAsia"/>
+          <w:lang w:val="en-US" w:eastAsia="zh-CN"/>
+        </w:rPr>
+      </w:pPr>
+    </w:p>
+    <w:p>
+      <w:pPr>
+        <w:numPr>
+          <w:ilvl w:val="0"/>
+          <w:numId w:val="4"/>
+        </w:numPr>
+        <w:rPr>
+          <w:rFonts w:hint="default"/>
+          <w:lang w:val="en-US" w:eastAsia="zh-CN"/>
+        </w:rPr>
+      </w:pPr>
+      <w:r>
+        <w:rPr>
+          <w:rFonts w:hint="eastAsia"/>
+          <w:lang w:val="en-US" w:eastAsia="zh-CN"/>
+        </w:rPr>
+        <w:t>所有的数据是不是统一居中展示比较好？现在看着还是不够统一，然后单位可以用灰色小字展示在column header下面，比如 “港澳台居民”是加粗的字，亿人次就可以是灰色小一点的字在它的下面</w:t>
+      </w:r>
+    </w:p>
+    <w:p>
+      <w:pPr>
+        <w:numPr>
+          <w:numId w:val="0"/>
+        </w:numPr>
+        <w:rPr>
+          <w:rFonts w:hint="eastAsia"/>
+          <w:lang w:val="en-US" w:eastAsia="zh-CN"/>
+        </w:rPr>
+      </w:pPr>
+    </w:p>
+    <w:p>
+      <w:pPr>
+        <w:numPr>
+          <w:ilvl w:val="0"/>
+          <w:numId w:val="4"/>
+        </w:numPr>
+        <w:ind w:left="0" w:leftChars="0" w:firstLine="0" w:firstLineChars="0"/>
+        <w:rPr>
+          <w:rFonts w:hint="default"/>
+          <w:lang w:val="en-US" w:eastAsia="zh-CN"/>
+        </w:rPr>
+      </w:pPr>
+      <w:r>
+        <w:rPr>
+          <w:rFonts w:hint="eastAsia"/>
+          <w:lang w:val="en-US" w:eastAsia="zh-CN"/>
+        </w:rPr>
+        <w:t>移民局的时期显示，也希望像文旅部，交通部一样，展示时间段，共几天</w:t>
+      </w:r>
+    </w:p>
+    <w:p>
+      <w:pPr>
+        <w:numPr>
+          <w:numId w:val="0"/>
+        </w:numPr>
+        <w:ind w:leftChars="0"/>
+        <w:rPr>
+          <w:rFonts w:hint="eastAsia"/>
+          <w:lang w:val="en-US" w:eastAsia="zh-CN"/>
+        </w:rPr>
+      </w:pPr>
+    </w:p>
+    <w:p>
+      <w:pPr>
+        <w:numPr>
+          <w:ilvl w:val="0"/>
+          <w:numId w:val="4"/>
+        </w:numPr>
+        <w:ind w:left="0" w:leftChars="0" w:firstLine="0" w:firstLineChars="0"/>
+        <w:rPr>
+          <w:rFonts w:hint="default"/>
+          <w:lang w:val="en-US" w:eastAsia="zh-CN"/>
+        </w:rPr>
+      </w:pPr>
+      <w:r>
+        <w:rPr>
+          <w:rFonts w:hint="eastAsia"/>
+          <w:lang w:val="en-US" w:eastAsia="zh-CN"/>
+        </w:rPr>
+        <w:t xml:space="preserve">我会再开一个excel表格，逐条review所有的数据，也作为records，这样我们就知道哪些数据review过了，针对miss掉的节假日，我prefer的方式还是做一行展示，然后说一下这一年没披露，不然如果用户比如filter某一年的元旦，就会没有返回结果，但是没有机会知道为什么当年少，只有filter了下一年的，没有同比，才知道。 嗯你先同步做这些改动吧，我逐条review数据了 </w:t>
+      </w:r>
+    </w:p>
+    <w:p>
+      <w:pPr>
+        <w:numPr>
+          <w:numId w:val="0"/>
+        </w:numPr>
+        <w:rPr>
+          <w:rFonts w:hint="eastAsia"/>
+          <w:lang w:val="en-US" w:eastAsia="zh-CN"/>
+        </w:rPr>
+      </w:pPr>
+    </w:p>
+    <w:p>
+      <w:pPr>
+        <w:numPr>
+          <w:ilvl w:val="0"/>
+          <w:numId w:val="4"/>
+        </w:numPr>
+        <w:ind w:left="0" w:leftChars="0" w:firstLine="0" w:firstLineChars="0"/>
+        <w:rPr>
+          <w:rFonts w:hint="default"/>
+          <w:lang w:val="en-US" w:eastAsia="zh-CN"/>
+        </w:rPr>
+      </w:pPr>
       <w:bookmarkStart w:id="0" w:name="_GoBack"/>
-      <w:r>
-        <w:rPr>
-          <w:rFonts w:hint="eastAsia"/>
-          <w:lang w:val="en-US" w:eastAsia="zh-CN"/>
-        </w:rPr>
-        <w:t>比较贴合我们网站的内容就可以，然后打开网站的时候，那个标签页也会对应展示</w:t>
-      </w:r>
-    </w:p>
-    <w:bookmarkEnd w:id="0"/>
-    <w:p>
-      <w:pPr>
-        <w:numPr>
-          <w:numId w:val="0"/>
-        </w:numPr>
-        <w:rPr>
-          <w:rFonts w:hint="eastAsia"/>
-          <w:lang w:val="en-US" w:eastAsia="zh-CN"/>
-        </w:rPr>
-      </w:pPr>
-    </w:p>
-    <w:p>
-      <w:pPr>
-        <w:numPr>
-          <w:ilvl w:val="0"/>
-          <w:numId w:val="2"/>
-        </w:numPr>
-        <w:ind w:left="0" w:leftChars="0" w:firstLine="0" w:firstLineChars="0"/>
-        <w:rPr>
-          <w:rFonts w:hint="default"/>
-          <w:lang w:val="en-US" w:eastAsia="zh-CN"/>
-        </w:rPr>
-      </w:pPr>
-      <w:r>
-        <w:rPr>
-          <w:rFonts w:hint="eastAsia"/>
-          <w:lang w:val="en-US" w:eastAsia="zh-CN"/>
-        </w:rPr>
-        <w:t>现在主页那个小飞机和太阳的位置有一些奇怪，飞机最好从右往左飞，现在是从下网上飞，其实icon的设计可以参考这个？icon可以跟飞机，数据等相关</w:t>
-      </w:r>
-    </w:p>
-    <w:p>
-      <w:pPr>
-        <w:numPr>
-          <w:numId w:val="0"/>
-        </w:numPr>
-        <w:rPr>
-          <w:rFonts w:hint="eastAsia"/>
-          <w:lang w:val="en-US" w:eastAsia="zh-CN"/>
-        </w:rPr>
-      </w:pPr>
-    </w:p>
-    <w:p>
-      <w:pPr>
-        <w:numPr>
-          <w:ilvl w:val="0"/>
-          <w:numId w:val="2"/>
-        </w:numPr>
-        <w:ind w:left="0" w:leftChars="0" w:firstLine="0" w:firstLineChars="0"/>
-        <w:rPr>
-          <w:rFonts w:hint="default"/>
-          <w:lang w:val="en-US" w:eastAsia="zh-CN"/>
-        </w:rPr>
-      </w:pPr>
-      <w:r>
-        <w:rPr>
-          <w:rFonts w:hint="eastAsia"/>
-          <w:lang w:val="en-US" w:eastAsia="zh-CN"/>
-        </w:rPr>
-        <w:t>数据更新状态，现在没说什么更新到什么时候，应该是文旅部更新到xxx这样</w:t>
-      </w:r>
-    </w:p>
-    <w:p>
-      <w:pPr>
-        <w:numPr>
-          <w:numId w:val="0"/>
-        </w:numPr>
-        <w:rPr>
-          <w:rFonts w:hint="eastAsia"/>
-          <w:lang w:val="en-US" w:eastAsia="zh-CN"/>
-        </w:rPr>
-      </w:pPr>
-    </w:p>
-    <w:p>
-      <w:pPr>
-        <w:numPr>
-          <w:ilvl w:val="0"/>
-          <w:numId w:val="2"/>
-        </w:numPr>
-        <w:ind w:left="0" w:leftChars="0" w:firstLine="0" w:firstLineChars="0"/>
-        <w:rPr>
-          <w:rFonts w:hint="default"/>
-          <w:lang w:val="en-US" w:eastAsia="zh-CN"/>
-        </w:rPr>
-      </w:pPr>
-      <w:r>
-        <w:rPr>
-          <w:rFonts w:hint="eastAsia"/>
-          <w:lang w:val="en-US" w:eastAsia="zh-CN"/>
-        </w:rPr>
-        <w:t>“留一下基本信息，方便我们未来做更精准的行业数据推送。“  我不喜欢”留一下基本信息“这个表述，比如可以说欢迎留下基本信息这种</w:t>
-      </w:r>
-    </w:p>
-    <w:p>
-      <w:pPr>
-        <w:numPr>
-          <w:numId w:val="0"/>
-        </w:numPr>
-        <w:rPr>
-          <w:rFonts w:hint="eastAsia"/>
-          <w:lang w:val="en-US" w:eastAsia="zh-CN"/>
-        </w:rPr>
-      </w:pPr>
-    </w:p>
-    <w:p>
-      <w:pPr>
-        <w:numPr>
-          <w:ilvl w:val="0"/>
-          <w:numId w:val="2"/>
-        </w:numPr>
-        <w:ind w:left="0" w:leftChars="0" w:firstLine="0" w:firstLineChars="0"/>
-        <w:rPr>
-          <w:rFonts w:hint="default"/>
-          <w:lang w:val="en-US" w:eastAsia="zh-CN"/>
-        </w:rPr>
-      </w:pPr>
-      <w:r>
-        <w:rPr>
-          <w:rFonts w:hint="eastAsia"/>
-          <w:lang w:val="en-US" w:eastAsia="zh-CN"/>
-        </w:rPr>
-        <w:t>支持我们是buy us a coffee还是buy me a coffee？是不是统一说我们比较好？“支持我们继续更新？” 我把赞赏码也换一下？</w:t>
-      </w:r>
-    </w:p>
-    <w:p>
-      <w:pPr>
-        <w:numPr>
-          <w:numId w:val="0"/>
-        </w:numPr>
-        <w:rPr>
-          <w:rFonts w:hint="eastAsia"/>
-          <w:lang w:val="en-US" w:eastAsia="zh-CN"/>
-        </w:rPr>
-      </w:pPr>
-    </w:p>
-    <w:p>
-      <w:pPr>
-        <w:numPr>
-          <w:ilvl w:val="0"/>
-          <w:numId w:val="2"/>
-        </w:numPr>
-        <w:ind w:left="0" w:leftChars="0" w:firstLine="0" w:firstLineChars="0"/>
-        <w:rPr>
-          <w:rFonts w:hint="default"/>
-          <w:lang w:val="en-US" w:eastAsia="zh-CN"/>
-        </w:rPr>
-      </w:pPr>
-      <w:r>
-        <w:rPr>
-          <w:rFonts w:hint="eastAsia"/>
-          <w:lang w:val="en-US" w:eastAsia="zh-CN"/>
-        </w:rPr>
-        <w:t>联系我们的数据存在哪里？我可以在哪里统一查找？如果我想快速做一个管理员页面，看都谁注册了，都谁留言了，就在这个网站上，麻烦嘛？</w:t>
-      </w:r>
-    </w:p>
-    <w:p>
-      <w:pPr>
-        <w:numPr>
-          <w:numId w:val="0"/>
-        </w:numPr>
-        <w:rPr>
-          <w:rFonts w:hint="eastAsia"/>
-          <w:lang w:val="en-US" w:eastAsia="zh-CN"/>
-        </w:rPr>
-      </w:pPr>
-    </w:p>
-    <w:p>
-      <w:pPr>
-        <w:numPr>
-          <w:numId w:val="0"/>
-        </w:numPr>
-        <w:rPr>
-          <w:rFonts w:hint="eastAsia"/>
-          <w:lang w:val="en-US" w:eastAsia="zh-CN"/>
-        </w:rPr>
-      </w:pPr>
-    </w:p>
-    <w:p>
-      <w:pPr>
-        <w:numPr>
-          <w:ilvl w:val="0"/>
-          <w:numId w:val="3"/>
-        </w:numPr>
-        <w:ind w:left="420" w:leftChars="0" w:hanging="420" w:firstLineChars="0"/>
-        <w:rPr>
-          <w:rFonts w:hint="default"/>
-          <w:lang w:val="en-US" w:eastAsia="zh-CN"/>
-        </w:rPr>
-      </w:pPr>
-      <w:r>
-        <w:rPr>
-          <w:rFonts w:hint="eastAsia"/>
-          <w:lang w:val="en-US" w:eastAsia="zh-CN"/>
-        </w:rPr>
-        <w:t>各数据页反馈</w:t>
-      </w:r>
-    </w:p>
-    <w:p>
-      <w:pPr>
-        <w:numPr>
-          <w:numId w:val="0"/>
-        </w:numPr>
-        <w:rPr>
-          <w:rFonts w:hint="eastAsia"/>
-          <w:lang w:val="en-US" w:eastAsia="zh-CN"/>
-        </w:rPr>
-      </w:pPr>
-    </w:p>
-    <w:p>
-      <w:pPr>
-        <w:numPr>
-          <w:ilvl w:val="0"/>
-          <w:numId w:val="4"/>
-        </w:numPr>
-        <w:rPr>
-          <w:rFonts w:hint="default"/>
-          <w:lang w:val="en-US" w:eastAsia="zh-CN"/>
-        </w:rPr>
-      </w:pPr>
-      <w:r>
-        <w:rPr>
-          <w:rFonts w:hint="eastAsia"/>
-          <w:lang w:val="en-US" w:eastAsia="zh-CN"/>
-        </w:rPr>
-        <w:t>所有的数据是不是统一居中展示比较好？现在看着还是不够统一，然后单位可以用灰色小字展示在column header下面，比如 “港澳台居民”是加粗的字，亿人次就可以是灰色小一点的字在它的下面</w:t>
-      </w:r>
-    </w:p>
-    <w:p>
-      <w:pPr>
-        <w:numPr>
-          <w:numId w:val="0"/>
-        </w:numPr>
-        <w:rPr>
-          <w:rFonts w:hint="eastAsia"/>
-          <w:lang w:val="en-US" w:eastAsia="zh-CN"/>
-        </w:rPr>
-      </w:pPr>
-    </w:p>
-    <w:p>
-      <w:pPr>
-        <w:numPr>
-          <w:ilvl w:val="0"/>
-          <w:numId w:val="4"/>
-        </w:numPr>
-        <w:ind w:left="0" w:leftChars="0" w:firstLine="0" w:firstLineChars="0"/>
-        <w:rPr>
-          <w:rFonts w:hint="default"/>
-          <w:lang w:val="en-US" w:eastAsia="zh-CN"/>
-        </w:rPr>
-      </w:pPr>
-      <w:r>
-        <w:rPr>
-          <w:rFonts w:hint="eastAsia"/>
-          <w:lang w:val="en-US" w:eastAsia="zh-CN"/>
-        </w:rPr>
-        <w:t>移民局的时期显示，也希望像文旅部，交通部一样，展示时间段，共几天</w:t>
-      </w:r>
-    </w:p>
-    <w:p>
-      <w:pPr>
-        <w:numPr>
-          <w:numId w:val="0"/>
-        </w:numPr>
-        <w:ind w:leftChars="0"/>
-        <w:rPr>
-          <w:rFonts w:hint="eastAsia"/>
-          <w:lang w:val="en-US" w:eastAsia="zh-CN"/>
-        </w:rPr>
-      </w:pPr>
-    </w:p>
-    <w:p>
-      <w:pPr>
-        <w:numPr>
-          <w:ilvl w:val="0"/>
-          <w:numId w:val="4"/>
-        </w:numPr>
-        <w:ind w:left="0" w:leftChars="0" w:firstLine="0" w:firstLineChars="0"/>
-        <w:rPr>
-          <w:rFonts w:hint="default"/>
-          <w:lang w:val="en-US" w:eastAsia="zh-CN"/>
-        </w:rPr>
-      </w:pPr>
-      <w:r>
-        <w:rPr>
-          <w:rFonts w:hint="eastAsia"/>
-          <w:lang w:val="en-US" w:eastAsia="zh-CN"/>
-        </w:rPr>
-        <w:t xml:space="preserve">我会再开一个excel表格，逐条review所有的数据，也作为records，这样我们就知道哪些数据review过了，针对miss掉的节假日，我prefer的方式还是做一行展示，然后说一下这一年没披露，不然如果用户比如filter某一年的元旦，就会没有返回结果，但是没有机会知道为什么当年少，只有filter了下一年的，没有同比，才知道。 嗯你先同步做这些改动吧，我逐条review数据了 </w:t>
+      <w:bookmarkEnd w:id="0"/>
+      <w:r>
+        <w:rPr>
+          <w:rFonts w:hint="default"/>
+          <w:lang w:val="en-US" w:eastAsia="zh-CN"/>
+        </w:rPr>
+        <w:t xml:space="preserve">我还希望发布日期的每个日期和节假日的每个节日，也能跳转到原文链接 </w:t>
       </w:r>
     </w:p>
     <w:sectPr>
@@ -786,6 +810,34 @@
       </w:tblCellMar>
     </w:tblPr>
   </w:style>
+  <w:style w:type="character" w:customStyle="1" w:styleId="4">
+    <w:name w:val="s1"/>
+    <w:uiPriority w:val="0"/>
+  </w:style>
+  <w:style w:type="character" w:customStyle="1" w:styleId="5">
+    <w:name w:val="s2"/>
+    <w:uiPriority w:val="0"/>
+    <w:rPr>
+      <w:color w:val="000000"/>
+    </w:rPr>
+  </w:style>
+  <w:style w:type="paragraph" w:customStyle="1" w:styleId="6">
+    <w:name w:val="p1"/>
+    <w:uiPriority w:val="0"/>
+    <w:pPr>
+      <w:spacing w:before="0" w:beforeAutospacing="0" w:after="0" w:afterAutospacing="0"/>
+      <w:ind w:left="0" w:right="0"/>
+      <w:jc w:val="left"/>
+    </w:pPr>
+    <w:rPr>
+      <w:rFonts w:ascii="menlo" w:hAnsi="menlo" w:eastAsia="menlo" w:cs="menlo"/>
+      <w:color w:val="87E2E1"/>
+      <w:kern w:val="0"/>
+      <w:sz w:val="22"/>
+      <w:szCs w:val="22"/>
+      <w:lang w:val="en-US" w:eastAsia="zh-CN" w:bidi="ar"/>
+    </w:rPr>
+  </w:style>
 </w:styles>
 </file>
 

</xml_diff>

<commit_message>
Left-align holiday column, top-align headers, nowrap MOT total header
</commit_message>
<xml_diff>
--- a/feedback/Datavoy review feedback.docx
+++ b/feedback/Datavoy review feedback.docx
@@ -422,14 +422,46 @@
           <w:lang w:val="en-US" w:eastAsia="zh-CN"/>
         </w:rPr>
       </w:pPr>
+      <w:r>
+        <w:rPr>
+          <w:rFonts w:hint="default"/>
+          <w:lang w:val="en-US" w:eastAsia="zh-CN"/>
+        </w:rPr>
+        <w:t xml:space="preserve">我还希望发布日期的每个日期和节假日的每个节日，也能跳转到原文链接 </w:t>
+      </w:r>
+    </w:p>
+    <w:p>
+      <w:pPr>
+        <w:numPr>
+          <w:numId w:val="0"/>
+        </w:numPr>
+        <w:ind w:leftChars="0"/>
+        <w:rPr>
+          <w:rFonts w:hint="default"/>
+          <w:lang w:val="en-US" w:eastAsia="zh-CN"/>
+        </w:rPr>
+      </w:pPr>
       <w:bookmarkStart w:id="0" w:name="_GoBack"/>
       <w:bookmarkEnd w:id="0"/>
-      <w:r>
-        <w:rPr>
-          <w:rFonts w:hint="default"/>
-          <w:lang w:val="en-US" w:eastAsia="zh-CN"/>
-        </w:rPr>
-        <w:t xml:space="preserve">我还希望发布日期的每个日期和节假日的每个节日，也能跳转到原文链接 </w:t>
+    </w:p>
+    <w:p>
+      <w:pPr>
+        <w:numPr>
+          <w:ilvl w:val="0"/>
+          <w:numId w:val="4"/>
+        </w:numPr>
+        <w:ind w:left="0" w:leftChars="0" w:firstLine="0" w:firstLineChars="0"/>
+        <w:rPr>
+          <w:rFonts w:hint="default"/>
+          <w:lang w:val="en-US" w:eastAsia="zh-CN"/>
+        </w:rPr>
+      </w:pPr>
+      <w:r>
+        <w:rPr>
+          <w:rFonts w:hint="default"/>
+          <w:lang w:val="en-US" w:eastAsia="zh-CN"/>
+        </w:rPr>
+        <w:t xml:space="preserve"> 发布日期和节假日支持跳转我看到了，但要像数字一样，我鼠标放上去，你有一个下划线的展示，让用户知道这个可以点    </w:t>
       </w:r>
     </w:p>
     <w:sectPr>
@@ -810,18 +842,27 @@
       </w:tblCellMar>
     </w:tblPr>
   </w:style>
-  <w:style w:type="character" w:customStyle="1" w:styleId="4">
+  <w:style w:type="paragraph" w:styleId="4">
+    <w:name w:val="Normal (Web)"/>
+    <w:basedOn w:val="1"/>
+    <w:uiPriority w:val="0"/>
+    <w:rPr>
+      <w:sz w:val="24"/>
+      <w:szCs w:val="24"/>
+    </w:rPr>
+  </w:style>
+  <w:style w:type="character" w:customStyle="1" w:styleId="5">
     <w:name w:val="s1"/>
     <w:uiPriority w:val="0"/>
   </w:style>
-  <w:style w:type="character" w:customStyle="1" w:styleId="5">
+  <w:style w:type="character" w:customStyle="1" w:styleId="6">
     <w:name w:val="s2"/>
     <w:uiPriority w:val="0"/>
     <w:rPr>
       <w:color w:val="000000"/>
     </w:rPr>
   </w:style>
-  <w:style w:type="paragraph" w:customStyle="1" w:styleId="6">
+  <w:style w:type="paragraph" w:customStyle="1" w:styleId="7">
     <w:name w:val="p1"/>
     <w:uiPriority w:val="0"/>
     <w:pPr>

</xml_diff>

<commit_message>
fix(chat): responsive formatting, i18n suggestions, railway/topic prompt, holiday translation
</commit_message>
<xml_diff>
--- a/feedback/Datavoy review feedback.docx
+++ b/feedback/Datavoy review feedback.docx
@@ -335,118 +335,23 @@
         </w:rPr>
         <w:t>所有的数据是不是统一居中展示比较好？现在看着还是不够统一，然后单位可以用灰色小字展示在column header下面，比如 “港澳台居民”是加粗的字，亿人次就可以是灰色小一点的字在它的下面</w:t>
       </w:r>
-    </w:p>
-    <w:p>
-      <w:pPr>
-        <w:numPr>
-          <w:numId w:val="0"/>
-        </w:numPr>
-        <w:rPr>
-          <w:rFonts w:hint="eastAsia"/>
-          <w:lang w:val="en-US" w:eastAsia="zh-CN"/>
-        </w:rPr>
-      </w:pPr>
-    </w:p>
-    <w:p>
-      <w:pPr>
-        <w:numPr>
-          <w:ilvl w:val="0"/>
-          <w:numId w:val="4"/>
-        </w:numPr>
-        <w:ind w:left="0" w:leftChars="0" w:firstLine="0" w:firstLineChars="0"/>
-        <w:rPr>
-          <w:rFonts w:hint="default"/>
-          <w:lang w:val="en-US" w:eastAsia="zh-CN"/>
-        </w:rPr>
-      </w:pPr>
-      <w:r>
-        <w:rPr>
-          <w:rFonts w:hint="eastAsia"/>
-          <w:lang w:val="en-US" w:eastAsia="zh-CN"/>
-        </w:rPr>
-        <w:t>移民局的时期显示，也希望像文旅部，交通部一样，展示时间段，共几天</w:t>
-      </w:r>
-    </w:p>
-    <w:p>
-      <w:pPr>
-        <w:numPr>
-          <w:numId w:val="0"/>
-        </w:numPr>
-        <w:ind w:leftChars="0"/>
-        <w:rPr>
-          <w:rFonts w:hint="eastAsia"/>
-          <w:lang w:val="en-US" w:eastAsia="zh-CN"/>
-        </w:rPr>
-      </w:pPr>
-    </w:p>
-    <w:p>
-      <w:pPr>
-        <w:numPr>
-          <w:ilvl w:val="0"/>
-          <w:numId w:val="4"/>
-        </w:numPr>
-        <w:ind w:left="0" w:leftChars="0" w:firstLine="0" w:firstLineChars="0"/>
-        <w:rPr>
-          <w:rFonts w:hint="default"/>
-          <w:lang w:val="en-US" w:eastAsia="zh-CN"/>
-        </w:rPr>
-      </w:pPr>
-      <w:r>
-        <w:rPr>
-          <w:rFonts w:hint="eastAsia"/>
-          <w:lang w:val="en-US" w:eastAsia="zh-CN"/>
-        </w:rPr>
-        <w:t xml:space="preserve">我会再开一个excel表格，逐条review所有的数据，也作为records，这样我们就知道哪些数据review过了，针对miss掉的节假日，我prefer的方式还是做一行展示，然后说一下这一年没披露，不然如果用户比如filter某一年的元旦，就会没有返回结果，但是没有机会知道为什么当年少，只有filter了下一年的，没有同比，才知道。 嗯你先同步做这些改动吧，我逐条review数据了 </w:t>
-      </w:r>
-    </w:p>
-    <w:p>
-      <w:pPr>
-        <w:numPr>
-          <w:numId w:val="0"/>
-        </w:numPr>
-        <w:rPr>
-          <w:rFonts w:hint="eastAsia"/>
-          <w:lang w:val="en-US" w:eastAsia="zh-CN"/>
-        </w:rPr>
-      </w:pPr>
-    </w:p>
-    <w:p>
-      <w:pPr>
-        <w:numPr>
-          <w:ilvl w:val="0"/>
-          <w:numId w:val="4"/>
-        </w:numPr>
-        <w:ind w:left="0" w:leftChars="0" w:firstLine="0" w:firstLineChars="0"/>
-        <w:rPr>
-          <w:rFonts w:hint="default"/>
-          <w:lang w:val="en-US" w:eastAsia="zh-CN"/>
-        </w:rPr>
-      </w:pPr>
-      <w:r>
-        <w:rPr>
-          <w:rFonts w:hint="default"/>
-          <w:lang w:val="en-US" w:eastAsia="zh-CN"/>
-        </w:rPr>
-        <w:t xml:space="preserve">我还希望发布日期的每个日期和节假日的每个节日，也能跳转到原文链接 </w:t>
-      </w:r>
-    </w:p>
-    <w:p>
-      <w:pPr>
-        <w:numPr>
-          <w:numId w:val="0"/>
-        </w:numPr>
-        <w:ind w:leftChars="0"/>
-        <w:rPr>
-          <w:rFonts w:hint="default"/>
-          <w:lang w:val="en-US" w:eastAsia="zh-CN"/>
-        </w:rPr>
-      </w:pPr>
       <w:bookmarkStart w:id="0" w:name="_GoBack"/>
       <w:bookmarkEnd w:id="0"/>
     </w:p>
     <w:p>
       <w:pPr>
         <w:numPr>
+          <w:numId w:val="0"/>
+        </w:numPr>
+        <w:rPr>
+          <w:rFonts w:hint="eastAsia"/>
+          <w:lang w:val="en-US" w:eastAsia="zh-CN"/>
+        </w:rPr>
+      </w:pPr>
+    </w:p>
+    <w:p>
+      <w:pPr>
+        <w:numPr>
           <w:ilvl w:val="0"/>
           <w:numId w:val="4"/>
         </w:numPr>
@@ -458,10 +363,198 @@
       </w:pPr>
       <w:r>
         <w:rPr>
+          <w:rFonts w:hint="eastAsia"/>
+          <w:lang w:val="en-US" w:eastAsia="zh-CN"/>
+        </w:rPr>
+        <w:t>移民局的时期显示，也希望像文旅部，交通部一样，展示时间段，共几天</w:t>
+      </w:r>
+    </w:p>
+    <w:p>
+      <w:pPr>
+        <w:numPr>
+          <w:numId w:val="0"/>
+        </w:numPr>
+        <w:ind w:leftChars="0"/>
+        <w:rPr>
+          <w:rFonts w:hint="eastAsia"/>
+          <w:lang w:val="en-US" w:eastAsia="zh-CN"/>
+        </w:rPr>
+      </w:pPr>
+    </w:p>
+    <w:p>
+      <w:pPr>
+        <w:numPr>
+          <w:ilvl w:val="0"/>
+          <w:numId w:val="4"/>
+        </w:numPr>
+        <w:ind w:left="0" w:leftChars="0" w:firstLine="0" w:firstLineChars="0"/>
+        <w:rPr>
+          <w:rFonts w:hint="default"/>
+          <w:lang w:val="en-US" w:eastAsia="zh-CN"/>
+        </w:rPr>
+      </w:pPr>
+      <w:r>
+        <w:rPr>
+          <w:rFonts w:hint="eastAsia"/>
+          <w:lang w:val="en-US" w:eastAsia="zh-CN"/>
+        </w:rPr>
+        <w:t xml:space="preserve">我会再开一个excel表格，逐条review所有的数据，也作为records，这样我们就知道哪些数据review过了，针对miss掉的节假日，我prefer的方式还是做一行展示，然后说一下这一年没披露，不然如果用户比如filter某一年的元旦，就会没有返回结果，但是没有机会知道为什么当年少，只有filter了下一年的，没有同比，才知道。 嗯你先同步做这些改动吧，我逐条review数据了 </w:t>
+      </w:r>
+    </w:p>
+    <w:p>
+      <w:pPr>
+        <w:numPr>
+          <w:numId w:val="0"/>
+        </w:numPr>
+        <w:rPr>
+          <w:rFonts w:hint="eastAsia"/>
+          <w:lang w:val="en-US" w:eastAsia="zh-CN"/>
+        </w:rPr>
+      </w:pPr>
+    </w:p>
+    <w:p>
+      <w:pPr>
+        <w:numPr>
+          <w:ilvl w:val="0"/>
+          <w:numId w:val="4"/>
+        </w:numPr>
+        <w:ind w:left="0" w:leftChars="0" w:firstLine="0" w:firstLineChars="0"/>
+        <w:rPr>
+          <w:rFonts w:hint="default"/>
+          <w:lang w:val="en-US" w:eastAsia="zh-CN"/>
+        </w:rPr>
+      </w:pPr>
+      <w:r>
+        <w:rPr>
+          <w:rFonts w:hint="default"/>
+          <w:lang w:val="en-US" w:eastAsia="zh-CN"/>
+        </w:rPr>
+        <w:t xml:space="preserve">我还希望发布日期的每个日期和节假日的每个节日，也能跳转到原文链接 </w:t>
+      </w:r>
+    </w:p>
+    <w:p>
+      <w:pPr>
+        <w:numPr>
+          <w:numId w:val="0"/>
+        </w:numPr>
+        <w:ind w:leftChars="0"/>
+        <w:rPr>
+          <w:rFonts w:hint="default"/>
+          <w:lang w:val="en-US" w:eastAsia="zh-CN"/>
+        </w:rPr>
+      </w:pPr>
+    </w:p>
+    <w:p>
+      <w:pPr>
+        <w:numPr>
+          <w:ilvl w:val="0"/>
+          <w:numId w:val="4"/>
+        </w:numPr>
+        <w:ind w:left="0" w:leftChars="0" w:firstLine="0" w:firstLineChars="0"/>
+        <w:rPr>
+          <w:rFonts w:hint="default"/>
+          <w:lang w:val="en-US" w:eastAsia="zh-CN"/>
+        </w:rPr>
+      </w:pPr>
+      <w:r>
+        <w:rPr>
           <w:rFonts w:hint="default"/>
           <w:lang w:val="en-US" w:eastAsia="zh-CN"/>
         </w:rPr>
         <w:t xml:space="preserve"> 发布日期和节假日支持跳转我看到了，但要像数字一样，我鼠标放上去，你有一个下划线的展示，让用户知道这个可以点    </w:t>
+      </w:r>
+    </w:p>
+    <w:p>
+      <w:pPr>
+        <w:numPr>
+          <w:numId w:val="0"/>
+        </w:numPr>
+        <w:rPr>
+          <w:rFonts w:hint="default"/>
+          <w:lang w:val="en-US" w:eastAsia="zh-CN"/>
+        </w:rPr>
+      </w:pPr>
+    </w:p>
+    <w:p>
+      <w:pPr>
+        <w:numPr>
+          <w:ilvl w:val="0"/>
+          <w:numId w:val="4"/>
+        </w:numPr>
+        <w:ind w:left="0" w:leftChars="0" w:firstLine="0" w:firstLineChars="0"/>
+        <w:rPr>
+          <w:rFonts w:hint="default"/>
+          <w:lang w:val="en-US" w:eastAsia="zh-CN"/>
+        </w:rPr>
+      </w:pPr>
+      <w:r>
+        <w:rPr>
+          <w:rFonts w:hint="eastAsia"/>
+          <w:lang w:val="en-US" w:eastAsia="zh-CN"/>
+        </w:rPr>
+        <w:t>交通部的数据源就是公众号，没有官网，数据说明改一下，包括单位，后面我们都改成万人次了</w:t>
+      </w:r>
+    </w:p>
+    <w:p>
+      <w:pPr>
+        <w:numPr>
+          <w:numId w:val="0"/>
+        </w:numPr>
+        <w:rPr>
+          <w:rFonts w:hint="eastAsia"/>
+          <w:lang w:val="en-US" w:eastAsia="zh-CN"/>
+        </w:rPr>
+      </w:pPr>
+    </w:p>
+    <w:p>
+      <w:pPr>
+        <w:numPr>
+          <w:ilvl w:val="0"/>
+          <w:numId w:val="4"/>
+        </w:numPr>
+        <w:ind w:left="0" w:leftChars="0" w:firstLine="0" w:firstLineChars="0"/>
+        <w:rPr>
+          <w:rFonts w:hint="default"/>
+          <w:lang w:val="en-US" w:eastAsia="zh-CN"/>
+        </w:rPr>
+      </w:pPr>
+      <w:r>
+        <w:rPr>
+          <w:rFonts w:hint="eastAsia"/>
+          <w:lang w:val="en-US" w:eastAsia="zh-CN"/>
+        </w:rPr>
+        <w:t>诶我现在选清空怎么是未披露呢？不对啊，不是未披露，你就像之前一样不展示就好了呀</w:t>
+      </w:r>
+    </w:p>
+    <w:p>
+      <w:pPr>
+        <w:numPr>
+          <w:numId w:val="0"/>
+        </w:numPr>
+        <w:rPr>
+          <w:rFonts w:hint="eastAsia"/>
+          <w:lang w:val="en-US" w:eastAsia="zh-CN"/>
+        </w:rPr>
+      </w:pPr>
+    </w:p>
+    <w:p>
+      <w:pPr>
+        <w:numPr>
+          <w:ilvl w:val="0"/>
+          <w:numId w:val="4"/>
+        </w:numPr>
+        <w:ind w:left="0" w:leftChars="0" w:firstLine="0" w:firstLineChars="0"/>
+        <w:rPr>
+          <w:rFonts w:hint="default"/>
+          <w:lang w:val="en-US" w:eastAsia="zh-CN"/>
+        </w:rPr>
+      </w:pPr>
+      <w:r>
+        <w:rPr>
+          <w:rFonts w:hint="eastAsia"/>
+          <w:lang w:val="en-US" w:eastAsia="zh-CN"/>
+        </w:rPr>
+        <w:t>移民局和交通部都存在有一些数据，有时候是万人次，有时候是亿人次，对于这种清空，整个column的单位取那个小的，万人次，如果官方数据是亿人次，就加0，页面底部的数据说明也对应更新一下</w:t>
       </w:r>
     </w:p>
     <w:sectPr>

</xml_diff>